<commit_message>
docs: complete TAB completion documentation across all surfaces
- CHANGELOG.md: [Unreleased] entries for TAB completion, docs rewrite,
  guide sheet redesign, and help improvements from this session.
- docs/cli-reference.md: new "Shell TAB completion" section at the top
  with bash/zsh activation instructions.
- cli.py: epilog on main parser shows activation command in --help output.
- docs_generator.py: TAB completion section added to guide sheet and
  grepxcel-guide.docx (between Available Commands and Pattern File Format).
- docs/ regenerated with the updated guide content.

Co-Authored-By: Claude Sonnet 4.6 <noreply@anthropic.com>
Claude-Session: https://claude.ai/code/session_01K6EyxWBecbqyp9uRx7c4J8
</commit_message>
<xml_diff>
--- a/docs/grepxcel-guide.docx
+++ b/docs/grepxcel-guide.docx
@@ -474,6 +474,43 @@
       </w:pPr>
       <w:r>
         <w:t xml:space="preserve">grepxcel schema pattern.xlsx</w:t>
+      </w:r>
+    </w:p>
+    <w:p>
+      <w:pPr>
+        <w:pStyle w:val="Normal"/>
+      </w:pPr>
+    </w:p>
+    <w:p>
+      <w:pPr>
+        <w:pStyle w:val="Heading2"/>
+      </w:pPr>
+      <w:r>
+        <w:t xml:space="preserve">Shell TAB Completion</w:t>
+      </w:r>
+    </w:p>
+    <w:p>
+      <w:pPr>
+        <w:pStyle w:val="Normal"/>
+      </w:pPr>
+      <w:r>
+        <w:t xml:space="preserve">grepxcel includes TAB completion for all subcommands and flags (bash, zsh, fish). Add this once to your shell config file to activate it:</w:t>
+      </w:r>
+    </w:p>
+    <w:p>
+      <w:pPr>
+        <w:pStyle w:val="Code"/>
+      </w:pPr>
+      <w:r>
+        <w:t xml:space="preserve">eval "$(register-python-argcomplete grepxcel)"</w:t>
+      </w:r>
+    </w:p>
+    <w:p>
+      <w:pPr>
+        <w:pStyle w:val="Normal"/>
+      </w:pPr>
+      <w:r>
+        <w:t xml:space="preserve">Add the line above to ~/.bashrc or ~/.zshrc, then open a new terminal. After that, pressing TAB after grepxcel completes subcommands and flags automatically.</w:t>
       </w:r>
     </w:p>
     <w:p>

</xml_diff>

<commit_message>
docs: document table:{n,m} in the generated pattern reference
The generated pattern-reference.xlsx / grepxcel-guide.docx described
DATA:{n,m} but had no entry for the new table:N / table:{n,m} multiplicity
semantics. Adds a doc line and a quick-reference row, and fixes the
fill-colour key derivation (rstrip(':*1') never stripped the trailing '}'
so a bracketed table row would have rendered unstyled). Artifacts
regenerated with `grepxcel docs -o docs/ --force` so CI's byte-diff check
stays current.

Co-Authored-By: Claude Fable 5.1 <noreply@anthropic.com>
Claude-Session: https://claude.ai/code/session_01K6EyxWBecbqyp9uRx7c4J8
</commit_message>
<xml_diff>
--- a/docs/grepxcel-guide.docx
+++ b/docs/grepxcel-guide.docx
@@ -705,15 +705,15 @@
         <w:pStyle w:val="Normal"/>
       </w:pPr>
       <w:r>
-        <w:t xml:space="preserve">grepxcel 0.4.0rc1</w:t>
-      </w:r>
-    </w:p>
-    <w:p>
-      <w:pPr>
-        <w:pStyle w:val="Normal"/>
-      </w:pPr>
-      <w:r>
-        <w:t xml:space="preserve">Generated:  2026-09-20 11:22 UTC</w:t>
+        <w:t xml:space="preserve">grepxcel 0.4.2rc2</w:t>
+      </w:r>
+    </w:p>
+    <w:p>
+      <w:pPr>
+        <w:pStyle w:val="Normal"/>
+      </w:pPr>
+      <w:r>
+        <w:t xml:space="preserve">Generated:  2026-09-26 18:27 UTC</w:t>
       </w:r>
     </w:p>
     <w:p>

</xml_diff>